<commit_message>
Troca declaração de quitação por comprovante de valores pagos
</commit_message>
<xml_diff>
--- a/src/main/webapp/modeloNegativoDebito2017.docx
+++ b/src/main/webapp/modeloNegativoDebito2017.docx
@@ -151,7 +151,7 @@
         <w:rPr>
           <w:b/>
         </w:rPr>
-        <w:t>DECLARAÇÃO DE QUITAÇÃO ANUAL DE DÉBITOS</w:t>
+        <w:t>COMPROVANTE DE VALORES PAGOS</w:t>
       </w:r>
     </w:p>
     <w:p>
@@ -171,93 +171,15 @@
         <w:jc w:val="center"/>
       </w:pPr>
       <w:r>
-        <w:t>Transporte Escolar Favo de mel</w:t>
-      </w:r>
-      <w:r>
-        <w:t xml:space="preserve"> CNPJ </w:t>
-      </w:r>
-      <w:r>
-        <w:t>03</w:t>
-      </w:r>
-      <w:r>
-        <w:t>.</w:t>
-      </w:r>
-      <w:r>
-        <w:t>660</w:t>
-      </w:r>
-      <w:r>
-        <w:t>.</w:t>
-      </w:r>
-      <w:r>
-        <w:t>921</w:t>
-      </w:r>
-      <w:r>
-        <w:t>/0001-</w:t>
-      </w:r>
-      <w:r>
-        <w:t>79</w:t>
-      </w:r>
-      <w:r>
-        <w:t>, com endereço na Rua José Cosme Pamplona nº 2001 – Bela Vista - Palhoça, vem, através desta e, nos termos da Lei nº 12.007/2009, decl</w:t>
-      </w:r>
-      <w:r>
-        <w:t>arar que adonainomeresponsavel</w:t>
-      </w:r>
-      <w:r>
-        <w:t xml:space="preserve"> CPF: </w:t>
-      </w:r>
-      <w:r>
-        <w:t>adonaicpfresponsavel</w:t>
-      </w:r>
-      <w:r>
-        <w:t>, encontra-se adimplente em relação a todas as parcelas do Contrato de Prestação de Serviços de Educação</w:t>
-      </w:r>
-      <w:r>
-        <w:t xml:space="preserve"> </w:t>
-      </w:r>
-      <w:r>
-        <w:t>transporte e</w:t>
-      </w:r>
-      <w:r>
-        <w:t xml:space="preserve">scolar  para o ano letivo de </w:t>
-      </w:r>
-      <w:r>
-        <w:t>adonaiano</w:t>
-      </w:r>
-      <w:r>
-        <w:t>,</w:t>
-      </w:r>
-      <w:r>
-        <w:t xml:space="preserve"> </w:t>
-      </w:r>
-      <w:r>
-        <w:t xml:space="preserve">com anuidade no valor total de R$ adonaianuidade (divididos em adonaiparcelas parcelas de R$ adonaivalorparcelas), </w:t>
-      </w:r>
-      <w:r>
-        <w:t xml:space="preserve"> cujo beneficiário foi o aluno </w:t>
-      </w:r>
-      <w:r>
-        <w:t>adonainomealuno</w:t>
-      </w:r>
-      <w:r>
-        <w:t>.</w:t>
-      </w:r>
-    </w:p>
-    <w:p>
-      <w:pPr>
-        <w:jc w:val="center"/>
-      </w:pPr>
-      <w:r>
-        <w:t>Esta declaração substitui todos os recibos de pagame</w:t>
-      </w:r>
-      <w:r>
-        <w:t xml:space="preserve">nto das mensalidades do ano de </w:t>
-      </w:r>
-      <w:r>
-        <w:t>adonaiano</w:t>
-      </w:r>
-      <w:r>
-        <w:t>.</w:t>
+        <w:t>Transporte Escolar Favo de mel CNPJ 03.660.921/0001-79, com endereço na Rua José Cosme Pamplona nº 2001 – Bela Vista - Palhoça, vem, através desta, declarar que adonainomeresponsavel CPF: adonaicpfresponsavel efetuou o pagamento de mensalidades referentes ao Contrato de Prestação de Serviços de Educação transporte escolar para o ano letivo de adonaiano, no valor total pago de R$ adonaianuidade, cujo beneficiário foi o aluno adonainomealuno.</w:t>
+      </w:r>
+    </w:p>
+    <w:p>
+      <w:pPr>
+        <w:jc w:val="center"/>
+      </w:pPr>
+      <w:r>
+        <w:t>Este comprovante refere-se apenas aos valores efetivamente pagos até a presente data, referentes ao ano de adonaiano, e não constitui declaração de quitação total do contrato.</w:t>
       </w:r>
     </w:p>
     <w:p>

</xml_diff>